<commit_message>
docs: point GoogleDoc bundle links at raw branch (release upload blocked in sandbox)
Co-authored-by: arena-agent <297053741+arena-agent@users.noreply.github.com>
</commit_message>
<xml_diff>
--- a/docs/CatPanel-6.44.0-GoogleDoc.docx
+++ b/docs/CatPanel-6.44.0-GoogleDoc.docx
@@ -274,21 +274,7 @@
           <w:sz w:val="30"/>
           <w:rtl/>
         </w:rPr>
-        <w:t>🌐 HTML پنل — صفحهٔ کامل آماده</w:t>
-      </w:r>
-    </w:p>
-    <w:p>
-      <w:pPr>
-        <w:spacing w:after="80"/>
-        <w:jc w:val="right"/>
-      </w:pPr>
-      <w:r>
-        <w:rPr>
-          <w:b w:val="0"/>
-          <w:sz w:val="21"/>
-          <w:rtl/>
-        </w:rPr>
-        <w:t>کل پنل در یک فایل HTML (نسخهٔ 6.44.0، فارسی) — پیش‌نمایش/بکاپ؛ بدون توکن:</w:t>
+        <w:t>🌐 HTML پنل — صفحهٔ کامل آماده (6.44.0، فارسی)</w:t>
       </w:r>
     </w:p>
     <w:p>
@@ -302,7 +288,7 @@
           <w:sz w:val="21"/>
           <w:rtl/>
         </w:rPr>
-        <w:t xml:space="preserve">⬇️ cat-panel-6.44.0.html:  </w:t>
+        <w:t xml:space="preserve">⬇️ cat-panel.html (لینک مستقیم از سورس):  </w:t>
       </w:r>
       <w:hyperlink r:id="rId18">
         <w:r>
@@ -311,7 +297,7 @@
             <w:u w:val="single"/>
             <w:sz w:val="21"/>
           </w:rPr>
-          <w:t>https://github.com/mazodimobinhost-creator/cat-client/releases/download/v1.10.0-beta64/cat-panel-6.44.0.html</w:t>
+          <w:t>https://github.com/mazodimobinhost-creator/cat-client/raw/arena/01a0ebed-cat-client/cat-panel.html</w:t>
         </w:r>
       </w:hyperlink>
     </w:p>
@@ -327,7 +313,22 @@
           <w:sz w:val="19"/>
           <w:rtl/>
         </w:rPr>
-        <w:t>نکته: این فایل فقط پیش‌نمایش است؛ دیپلوی واقعی پنل همیشه با worker.js انجام می‌شود (Deploy-to-CF یا Actions).</w:t>
+        <w:t>اگر لینک باز نشد، همین را پشت آینه بگذار: https://ghproxy.net/ + آدرس</w:t>
+      </w:r>
+    </w:p>
+    <w:p>
+      <w:pPr>
+        <w:spacing w:after="80"/>
+        <w:jc w:val="right"/>
+      </w:pPr>
+      <w:r>
+        <w:rPr>
+          <w:b w:val="0"/>
+          <w:color w:val="965050"/>
+          <w:sz w:val="19"/>
+          <w:rtl/>
+        </w:rPr>
+        <w:t>نکته: این فایل پیش‌نمایش/بکاپ صفحهٔ پنل است؛ دیپلوی واقعی همیشه با worker.js (Deploy-to-CF یا Actions).</w:t>
       </w:r>
     </w:p>
     <w:p>
@@ -356,7 +357,7 @@
           <w:sz w:val="21"/>
           <w:rtl/>
         </w:rPr>
-        <w:t xml:space="preserve">📄 سند جاری (docx — در رلیز هم هست):  </w:t>
+        <w:t xml:space="preserve">📄 سند جاری (docx):  </w:t>
       </w:r>
       <w:hyperlink r:id="rId19">
         <w:r>
@@ -365,7 +366,7 @@
             <w:u w:val="single"/>
             <w:sz w:val="21"/>
           </w:rPr>
-          <w:t>https://github.com/mazodimobinhost-creator/cat-client/releases/download/v1.10.0-beta64/CatPanel-6.44.0-GoogleDoc.docx</w:t>
+          <w:t>https://github.com/mazodimobinhost-creator/cat-client/raw/arena/01a0ebed-cat-client/docs/CatPanel-6.44.0-GoogleDoc.docx</w:t>
         </w:r>
       </w:hyperlink>
     </w:p>
@@ -556,7 +557,7 @@
           <w:sz w:val="21"/>
           <w:rtl/>
         </w:rPr>
-        <w:t>۳) فایل docx (همین سند) در گوگل داکیومنت مستقیم باز و ویرایش می‌شود — دابل‌کلیک کن یا از Docs گزینهٔ File → Open را بزن.</w:t>
+        <w:t>۳) فایل docx (همین سند) در گوگل داکیومنت مستقیم باز و ویرایش می‌شود — دابل‌کلیک کن یا از Docs: File → Open.</w:t>
       </w:r>
     </w:p>
     <w:p>
@@ -571,7 +572,7 @@
           <w:sz w:val="19"/>
           <w:rtl/>
         </w:rPr>
-        <w:t>⚠️ امنیت: worker.js و HTML پنل هیچ توکنی ندارند و اشتراک‌شان امن است؛ اما تنظیمات واقعی پنل (فایل خروجی JSON از خود پنل) می‌تواند مسیر/UUID داشته باشد — آن را فقط برای خودت نگه دار.</w:t>
+        <w:t>⚠️ امنیت: worker.js و HTML پنل هیچ توکنی ندارند؛ اما فایل «خروجی تنظیمات» خودِ پنل (اگر جایی ذخیره‌اش کردی) مسیر و UUID دارد — فقط برای خودت.</w:t>
       </w:r>
     </w:p>
     <w:sectPr>

</xml_diff>